<commit_message>
Update docs and web UI
</commit_message>
<xml_diff>
--- a/71812353008kitchen app.docx
+++ b/71812353008kitchen app.docx
@@ -18,16 +18,7 @@
           <w:rFonts w:hint="default" w:ascii="Times New Roman" w:hAnsi="Times New Roman" w:cs="Times New Roman"/>
           <w:lang w:val="en-GB"/>
         </w:rPr>
-        <w:t xml:space="preserve">AKASH N K(71812353008) </w:t>
-      </w:r>
-      <w:bookmarkStart w:id="0" w:name="_GoBack"/>
-      <w:bookmarkEnd w:id="0"/>
-      <w:r>
-        <w:rPr>
-          <w:rFonts w:hint="default" w:ascii="Times New Roman" w:hAnsi="Times New Roman" w:cs="Times New Roman"/>
-          <w:lang w:val="en-GB"/>
-        </w:rPr>
-        <w:t xml:space="preserve"> KITCHEN APP:</w:t>
+        <w:t>AKASH N K(71812353008)  KITCHEN APP:</w:t>
       </w:r>
     </w:p>
     <w:p>
@@ -399,19 +390,11 @@
         </w:rPr>
       </w:pPr>
       <w:r>
-        <w:rPr>
-          <w:rFonts w:hint="default" w:ascii="Times New Roman" w:hAnsi="Times New Roman" w:cs="Times New Roman"/>
-          <w:b/>
-          <w:bCs/>
-          <w:sz w:val="24"/>
-          <w:szCs w:val="24"/>
-          <w:lang w:val="en-GB"/>
-        </w:rPr>
         <w:drawing>
           <wp:inline distT="0" distB="0" distL="114300" distR="114300">
             <wp:extent cx="5265420" cy="2959100"/>
             <wp:effectExtent l="0" t="0" r="11430" b="12700"/>
-            <wp:docPr id="9" name="Picture 9" descr="Screenshot 2026-03-22 223058"/>
+            <wp:docPr id="8" name="Picture 1"/>
             <wp:cNvGraphicFramePr>
               <a:graphicFrameLocks xmlns:a="http://schemas.openxmlformats.org/drawingml/2006/main" noChangeAspect="1"/>
             </wp:cNvGraphicFramePr>
@@ -419,7 +402,7 @@
               <a:graphicData uri="http://schemas.openxmlformats.org/drawingml/2006/picture">
                 <pic:pic xmlns:pic="http://schemas.openxmlformats.org/drawingml/2006/picture">
                   <pic:nvPicPr>
-                    <pic:cNvPr id="9" name="Picture 9" descr="Screenshot 2026-03-22 223058"/>
+                    <pic:cNvPr id="8" name="Picture 1"/>
                     <pic:cNvPicPr>
                       <a:picLocks noChangeAspect="1"/>
                     </pic:cNvPicPr>
@@ -438,6 +421,10 @@
                     <a:prstGeom prst="rect">
                       <a:avLst/>
                     </a:prstGeom>
+                    <a:noFill/>
+                    <a:ln>
+                      <a:noFill/>
+                    </a:ln>
                   </pic:spPr>
                 </pic:pic>
               </a:graphicData>
@@ -445,6 +432,8 @@
           </wp:inline>
         </w:drawing>
       </w:r>
+      <w:bookmarkStart w:id="0" w:name="_GoBack"/>
+      <w:bookmarkEnd w:id="0"/>
     </w:p>
     <w:sectPr>
       <w:pgSz w:w="11906" w:h="16838"/>

</xml_diff>